<commit_message>
feature:criação da tela de login
</commit_message>
<xml_diff>
--- a/Documentação/SDA-T10-2024.1-PolíticaGeralDeSegurança-240307 2.docx
+++ b/Documentação/SDA-T10-2024.1-PolíticaGeralDeSegurança-240307 2.docx
@@ -3773,16 +3773,20 @@
                 <w:noProof/>
                 <w:webHidden/>
               </w:rPr>
+            </w:r>
+            <w:r>
+              <w:rPr>
+                <w:noProof/>
+                <w:webHidden/>
+              </w:rPr>
               <w:fldChar w:fldCharType="separate"/>
             </w:r>
             <w:r>
               <w:rPr>
-                <w:b/>
-                <w:bCs/>
-                <w:noProof/>
-                <w:webHidden/>
-              </w:rPr>
-              <w:t>Erro! Indicador não definido.</w:t>
+                <w:noProof/>
+                <w:webHidden/>
+              </w:rPr>
+              <w:t>12</w:t>
             </w:r>
             <w:r>
               <w:rPr>
@@ -9186,28 +9190,6 @@
           <w:sz w:val="24"/>
           <w:szCs w:val="24"/>
         </w:rPr>
-        <w:t>9</w:t>
-      </w:r>
-      <w:r>
-        <w:rPr>
-          <w:rFonts w:ascii="Arial" w:hAnsi="Arial" w:cs="Arial"/>
-          <w:b/>
-          <w:bCs/>
-          <w:color w:val="auto"/>
-          <w:sz w:val="24"/>
-          <w:szCs w:val="24"/>
-        </w:rPr>
-        <w:tab/>
-      </w:r>
-      <w:r>
-        <w:rPr>
-          <w:rFonts w:ascii="Arial" w:hAnsi="Arial" w:cs="Arial"/>
-          <w:b/>
-          <w:bCs/>
-          <w:color w:val="auto"/>
-          <w:sz w:val="24"/>
-          <w:szCs w:val="24"/>
-        </w:rPr>
         <w:t>Au</w:t>
       </w:r>
       <w:r>
@@ -9352,26 +9334,7 @@
           <w:sz w:val="24"/>
           <w:szCs w:val="24"/>
         </w:rPr>
-        <w:t xml:space="preserve">Identificadores Únicos para Contas de Usuário: Cada conta de usuário será associada a um email de usuário exclusivo, que </w:t>
-      </w:r>
-      <w:r>
-        <w:rPr>
-          <w:rFonts w:ascii="Arial" w:eastAsia="Arial" w:hAnsi="Arial" w:cs="Arial"/>
-          <w:color w:val="000000" w:themeColor="text1"/>
-          <w:sz w:val="24"/>
-          <w:szCs w:val="24"/>
-          <w:u w:val="single"/>
-        </w:rPr>
-        <w:t>não</w:t>
-      </w:r>
-      <w:r>
-        <w:rPr>
-          <w:rFonts w:ascii="Arial" w:eastAsia="Arial" w:hAnsi="Arial" w:cs="Arial"/>
-          <w:color w:val="000000" w:themeColor="text1"/>
-          <w:sz w:val="24"/>
-          <w:szCs w:val="24"/>
-        </w:rPr>
-        <w:t xml:space="preserve"> é compartilhado com outros usuários e está vinculado a um indivíduo específico.</w:t>
+        <w:t>Identificadores Únicos para Contas de Usuário: Cada conta de usuário será associada a um email de usuário exclusivo, que não é compartilhado com outros usuários e está vinculado a um indivíduo específico.</w:t>
       </w:r>
     </w:p>
     <w:p>
@@ -10855,34 +10818,6 @@
     </w:p>
     <w:p>
       <w:pPr>
-        <w:rPr>
-          <w:rFonts w:ascii="Arial" w:eastAsia="Arial" w:hAnsi="Arial" w:cs="Arial"/>
-          <w:color w:val="000000" w:themeColor="text1"/>
-          <w:sz w:val="24"/>
-          <w:szCs w:val="24"/>
-        </w:rPr>
-      </w:pPr>
-    </w:p>
-    <w:p>
-      <w:pPr>
-        <w:rPr>
-          <w:rFonts w:ascii="Arial" w:eastAsia="Arial" w:hAnsi="Arial" w:cs="Arial"/>
-          <w:sz w:val="24"/>
-          <w:szCs w:val="24"/>
-        </w:rPr>
-      </w:pPr>
-    </w:p>
-    <w:p>
-      <w:pPr>
-        <w:rPr>
-          <w:rFonts w:ascii="Arial" w:eastAsia="Arial" w:hAnsi="Arial" w:cs="Arial"/>
-          <w:sz w:val="24"/>
-          <w:szCs w:val="24"/>
-        </w:rPr>
-      </w:pPr>
-    </w:p>
-    <w:p>
-      <w:pPr>
         <w:pStyle w:val="Ttulo2"/>
         <w:numPr>
           <w:ilvl w:val="1"/>
@@ -10898,126 +10833,24 @@
           <w:szCs w:val="24"/>
         </w:rPr>
       </w:pPr>
-      <w:bookmarkStart w:id="37" w:name="_Toc171253025"/>
-      <w:r>
-        <w:rPr>
-          <w:rFonts w:ascii="Arial" w:eastAsia="Arial" w:hAnsi="Arial" w:cs="Arial"/>
-          <w:b/>
-          <w:bCs/>
-          <w:color w:val="auto"/>
-          <w:sz w:val="24"/>
-          <w:szCs w:val="24"/>
-        </w:rPr>
-        <w:t>10</w:t>
-      </w:r>
-      <w:r>
-        <w:rPr>
-          <w:rFonts w:ascii="Arial" w:hAnsi="Arial" w:cs="Arial"/>
-        </w:rPr>
-        <w:tab/>
-      </w:r>
-      <w:r>
-        <w:rPr>
-          <w:rFonts w:ascii="Arial" w:eastAsia="Arial" w:hAnsi="Arial" w:cs="Arial"/>
-          <w:b/>
-          <w:bCs/>
-          <w:color w:val="auto"/>
-          <w:sz w:val="24"/>
-          <w:szCs w:val="24"/>
-        </w:rPr>
-        <w:t>Rede</w:t>
-      </w:r>
-      <w:bookmarkEnd w:id="37"/>
-    </w:p>
-    <w:p>
-      <w:pPr>
-        <w:rPr>
-          <w:rFonts w:ascii="Arial" w:eastAsia="Arial" w:hAnsi="Arial" w:cs="Arial"/>
-          <w:sz w:val="24"/>
-          <w:szCs w:val="24"/>
-        </w:rPr>
-      </w:pPr>
-    </w:p>
-    <w:p>
-      <w:pPr>
-        <w:ind w:left="720"/>
-        <w:rPr>
-          <w:rFonts w:ascii="Arial" w:eastAsia="Arial" w:hAnsi="Arial" w:cs="Arial"/>
-          <w:color w:val="000000" w:themeColor="text1"/>
-          <w:sz w:val="24"/>
-          <w:szCs w:val="24"/>
-        </w:rPr>
-      </w:pPr>
-      <w:r>
-        <w:rPr>
-          <w:rFonts w:ascii="Arial" w:eastAsia="Arial" w:hAnsi="Arial" w:cs="Arial"/>
-          <w:color w:val="000000" w:themeColor="text1"/>
-          <w:sz w:val="24"/>
-          <w:szCs w:val="24"/>
-        </w:rPr>
-        <w:t xml:space="preserve">1. Os sistemas e/ou dispositivos não devem ser conectados à rede da </w:t>
-      </w:r>
-      <w:r>
-        <w:rPr>
-          <w:rFonts w:ascii="Arial" w:eastAsia="Arial" w:hAnsi="Arial" w:cs="Arial"/>
-          <w:color w:val="000000" w:themeColor="text1"/>
-          <w:sz w:val="24"/>
-          <w:szCs w:val="24"/>
-        </w:rPr>
-        <w:t>MoveSmart</w:t>
-      </w:r>
-      <w:r>
-        <w:rPr>
-          <w:rFonts w:ascii="Arial" w:eastAsia="Arial" w:hAnsi="Arial" w:cs="Arial"/>
-          <w:color w:val="000000" w:themeColor="text1"/>
-          <w:sz w:val="24"/>
-          <w:szCs w:val="24"/>
-        </w:rPr>
-        <w:t xml:space="preserve"> sem a autorização prévia do proprietário do ativo da </w:t>
-      </w:r>
-      <w:r>
-        <w:rPr>
-          <w:rFonts w:ascii="Arial" w:eastAsia="Arial" w:hAnsi="Arial" w:cs="Arial"/>
-          <w:color w:val="000000" w:themeColor="text1"/>
-          <w:sz w:val="24"/>
-          <w:szCs w:val="24"/>
-        </w:rPr>
-        <w:t>MoveSmart</w:t>
-      </w:r>
-      <w:r>
-        <w:rPr>
-          <w:rFonts w:ascii="Arial" w:eastAsia="Arial" w:hAnsi="Arial" w:cs="Arial"/>
-          <w:color w:val="000000" w:themeColor="text1"/>
-          <w:sz w:val="24"/>
-          <w:szCs w:val="24"/>
-        </w:rPr>
-        <w:t xml:space="preserve"> correspondente.</w:t>
-      </w:r>
-    </w:p>
-    <w:p>
-      <w:pPr>
-        <w:ind w:left="720"/>
-        <w:rPr>
-          <w:rFonts w:ascii="Arial" w:eastAsia="Arial" w:hAnsi="Arial" w:cs="Arial"/>
-          <w:color w:val="000000" w:themeColor="text1"/>
-          <w:sz w:val="24"/>
-          <w:szCs w:val="24"/>
-        </w:rPr>
-      </w:pPr>
-      <w:r>
-        <w:rPr>
-          <w:rFonts w:ascii="Arial" w:eastAsia="Arial" w:hAnsi="Arial" w:cs="Arial"/>
-          <w:color w:val="000000" w:themeColor="text1"/>
-          <w:sz w:val="24"/>
-          <w:szCs w:val="24"/>
-        </w:rPr>
-        <w:t>2. A Função de Provisionamento deve ser responsável por manter o controle de acesso à rede e impedir que dispositivos não autorizados acessem a rede.</w:t>
-      </w:r>
-    </w:p>
-    <w:p>
-      <w:pPr>
-        <w:rPr>
-          <w:rFonts w:ascii="Arial" w:eastAsia="Arial" w:hAnsi="Arial" w:cs="Arial"/>
+    </w:p>
+    <w:p>
+      <w:pPr>
+        <w:ind w:left="720"/>
+        <w:rPr>
+          <w:rFonts w:ascii="Arial" w:eastAsia="Arial" w:hAnsi="Arial" w:cs="Arial"/>
+          <w:color w:val="000000" w:themeColor="text1"/>
+          <w:sz w:val="24"/>
+          <w:szCs w:val="24"/>
+        </w:rPr>
+      </w:pPr>
+    </w:p>
+    <w:p>
+      <w:pPr>
+        <w:ind w:left="720"/>
+        <w:rPr>
+          <w:rFonts w:ascii="Arial" w:eastAsia="Arial" w:hAnsi="Arial" w:cs="Arial"/>
+          <w:color w:val="000000" w:themeColor="text1"/>
           <w:sz w:val="24"/>
           <w:szCs w:val="24"/>
         </w:rPr>
@@ -11040,7 +10873,7 @@
           <w:szCs w:val="24"/>
         </w:rPr>
       </w:pPr>
-      <w:bookmarkStart w:id="38" w:name="_Toc171253026"/>
+      <w:bookmarkStart w:id="37" w:name="_Toc171253024"/>
       <w:r>
         <w:rPr>
           <w:rFonts w:ascii="Arial" w:eastAsia="Arial" w:hAnsi="Arial" w:cs="Arial"/>
@@ -11050,75 +10883,23 @@
           <w:sz w:val="24"/>
           <w:szCs w:val="24"/>
         </w:rPr>
-        <w:t>11</w:t>
-      </w:r>
-      <w:r>
-        <w:rPr>
-          <w:rFonts w:ascii="Arial" w:hAnsi="Arial" w:cs="Arial"/>
-        </w:rPr>
-        <w:tab/>
-      </w:r>
-      <w:r>
-        <w:rPr>
-          <w:rFonts w:ascii="Arial" w:eastAsia="Arial" w:hAnsi="Arial" w:cs="Arial"/>
-          <w:b/>
-          <w:bCs/>
-          <w:color w:val="auto"/>
-          <w:sz w:val="24"/>
-          <w:szCs w:val="24"/>
-        </w:rPr>
-        <w:t>Criptografia</w:t>
-      </w:r>
-      <w:bookmarkEnd w:id="38"/>
-    </w:p>
-    <w:p>
-      <w:pPr>
-        <w:ind w:left="720"/>
-        <w:rPr>
-          <w:rFonts w:ascii="Arial" w:eastAsia="Arial" w:hAnsi="Arial" w:cs="Arial"/>
-          <w:color w:val="000000" w:themeColor="text1"/>
-          <w:sz w:val="24"/>
-          <w:szCs w:val="24"/>
-        </w:rPr>
-      </w:pPr>
-    </w:p>
-    <w:p>
-      <w:pPr>
-        <w:ind w:left="720"/>
-        <w:rPr>
-          <w:rFonts w:ascii="Arial" w:eastAsia="Arial" w:hAnsi="Arial" w:cs="Arial"/>
-          <w:color w:val="000000" w:themeColor="text1"/>
-          <w:sz w:val="24"/>
-          <w:szCs w:val="24"/>
-        </w:rPr>
-      </w:pPr>
-      <w:r>
-        <w:rPr>
-          <w:rFonts w:ascii="Arial" w:eastAsia="Arial" w:hAnsi="Arial" w:cs="Arial"/>
-          <w:color w:val="000000" w:themeColor="text1"/>
-          <w:sz w:val="24"/>
-          <w:szCs w:val="24"/>
-        </w:rPr>
-        <w:t>Iremos implementar a criptografia bcrypt para proteger dados em repouso, pois é uma tecnologia amplamente reconhecida e utilizada, com uma comunidade ativa que facilita a correção de possíveis falhas de forma rápida, simples e eficaz. As chaves de criptografia serão gerenciadas de forma segura para garantir a integridade do sistema.</w:t>
-      </w:r>
-    </w:p>
-    <w:p>
-      <w:pPr>
-        <w:ind w:left="720"/>
-        <w:rPr>
-          <w:rFonts w:ascii="Arial" w:eastAsia="Arial" w:hAnsi="Arial" w:cs="Arial"/>
-          <w:color w:val="0000FF"/>
-          <w:sz w:val="24"/>
-          <w:szCs w:val="24"/>
-        </w:rPr>
-      </w:pPr>
-    </w:p>
-    <w:p>
-      <w:pPr>
-        <w:ind w:left="720"/>
-        <w:rPr>
-          <w:rFonts w:ascii="Arial" w:eastAsia="Arial" w:hAnsi="Arial" w:cs="Arial"/>
-          <w:color w:val="000000" w:themeColor="text1"/>
+        <w:t>Proteção de Dados</w:t>
+      </w:r>
+      <w:bookmarkEnd w:id="37"/>
+    </w:p>
+    <w:p>
+      <w:pPr>
+        <w:rPr>
+          <w:rFonts w:ascii="Arial" w:eastAsia="Arial" w:hAnsi="Arial" w:cs="Arial"/>
+          <w:sz w:val="24"/>
+          <w:szCs w:val="24"/>
+        </w:rPr>
+      </w:pPr>
+    </w:p>
+    <w:p>
+      <w:pPr>
+        <w:rPr>
+          <w:rFonts w:ascii="Arial" w:eastAsia="Arial" w:hAnsi="Arial" w:cs="Arial"/>
           <w:sz w:val="24"/>
           <w:szCs w:val="24"/>
         </w:rPr>
@@ -11141,7 +10922,7 @@
           <w:szCs w:val="24"/>
         </w:rPr>
       </w:pPr>
-      <w:bookmarkStart w:id="39" w:name="_Toc171253027"/>
+      <w:bookmarkStart w:id="38" w:name="_Toc171253025"/>
       <w:r>
         <w:rPr>
           <w:rFonts w:ascii="Arial" w:eastAsia="Arial" w:hAnsi="Arial" w:cs="Arial"/>
@@ -11151,7 +10932,7 @@
           <w:sz w:val="24"/>
           <w:szCs w:val="24"/>
         </w:rPr>
-        <w:t>12</w:t>
+        <w:t>10</w:t>
       </w:r>
       <w:r>
         <w:rPr>
@@ -11168,9 +10949,252 @@
           <w:sz w:val="24"/>
           <w:szCs w:val="24"/>
         </w:rPr>
+        <w:t>Rede</w:t>
+      </w:r>
+      <w:bookmarkEnd w:id="38"/>
+    </w:p>
+    <w:p>
+      <w:pPr>
+        <w:rPr>
+          <w:rFonts w:ascii="Arial" w:eastAsia="Arial" w:hAnsi="Arial" w:cs="Arial"/>
+          <w:sz w:val="24"/>
+          <w:szCs w:val="24"/>
+        </w:rPr>
+      </w:pPr>
+    </w:p>
+    <w:p>
+      <w:pPr>
+        <w:ind w:left="720"/>
+        <w:rPr>
+          <w:rFonts w:ascii="Arial" w:eastAsia="Arial" w:hAnsi="Arial" w:cs="Arial"/>
+          <w:color w:val="000000" w:themeColor="text1"/>
+          <w:sz w:val="24"/>
+          <w:szCs w:val="24"/>
+        </w:rPr>
+      </w:pPr>
+      <w:r>
+        <w:rPr>
+          <w:rFonts w:ascii="Arial" w:eastAsia="Arial" w:hAnsi="Arial" w:cs="Arial"/>
+          <w:color w:val="000000" w:themeColor="text1"/>
+          <w:sz w:val="24"/>
+          <w:szCs w:val="24"/>
+        </w:rPr>
+        <w:t xml:space="preserve">1. Os sistemas e/ou dispositivos não devem ser conectados à rede da </w:t>
+      </w:r>
+      <w:r>
+        <w:rPr>
+          <w:rFonts w:ascii="Arial" w:eastAsia="Arial" w:hAnsi="Arial" w:cs="Arial"/>
+          <w:color w:val="000000" w:themeColor="text1"/>
+          <w:sz w:val="24"/>
+          <w:szCs w:val="24"/>
+        </w:rPr>
+        <w:t>MoveSmart</w:t>
+      </w:r>
+      <w:r>
+        <w:rPr>
+          <w:rFonts w:ascii="Arial" w:eastAsia="Arial" w:hAnsi="Arial" w:cs="Arial"/>
+          <w:color w:val="000000" w:themeColor="text1"/>
+          <w:sz w:val="24"/>
+          <w:szCs w:val="24"/>
+        </w:rPr>
+        <w:t xml:space="preserve"> sem a autorização prévia do proprietário do ativo da </w:t>
+      </w:r>
+      <w:r>
+        <w:rPr>
+          <w:rFonts w:ascii="Arial" w:eastAsia="Arial" w:hAnsi="Arial" w:cs="Arial"/>
+          <w:color w:val="000000" w:themeColor="text1"/>
+          <w:sz w:val="24"/>
+          <w:szCs w:val="24"/>
+        </w:rPr>
+        <w:t>MoveSmart</w:t>
+      </w:r>
+      <w:r>
+        <w:rPr>
+          <w:rFonts w:ascii="Arial" w:eastAsia="Arial" w:hAnsi="Arial" w:cs="Arial"/>
+          <w:color w:val="000000" w:themeColor="text1"/>
+          <w:sz w:val="24"/>
+          <w:szCs w:val="24"/>
+        </w:rPr>
+        <w:t xml:space="preserve"> correspondente.</w:t>
+      </w:r>
+    </w:p>
+    <w:p>
+      <w:pPr>
+        <w:ind w:left="720"/>
+        <w:rPr>
+          <w:rFonts w:ascii="Arial" w:eastAsia="Arial" w:hAnsi="Arial" w:cs="Arial"/>
+          <w:color w:val="000000" w:themeColor="text1"/>
+          <w:sz w:val="24"/>
+          <w:szCs w:val="24"/>
+        </w:rPr>
+      </w:pPr>
+      <w:r>
+        <w:rPr>
+          <w:rFonts w:ascii="Arial" w:eastAsia="Arial" w:hAnsi="Arial" w:cs="Arial"/>
+          <w:color w:val="000000" w:themeColor="text1"/>
+          <w:sz w:val="24"/>
+          <w:szCs w:val="24"/>
+        </w:rPr>
+        <w:t>2. A Função de Provisionamento deve ser responsável por manter o controle de acesso à rede e impedir que dispositivos não autorizados acessem a rede.</w:t>
+      </w:r>
+    </w:p>
+    <w:p>
+      <w:pPr>
+        <w:rPr>
+          <w:rFonts w:ascii="Arial" w:eastAsia="Arial" w:hAnsi="Arial" w:cs="Arial"/>
+          <w:sz w:val="24"/>
+          <w:szCs w:val="24"/>
+        </w:rPr>
+      </w:pPr>
+    </w:p>
+    <w:p>
+      <w:pPr>
+        <w:pStyle w:val="Ttulo2"/>
+        <w:numPr>
+          <w:ilvl w:val="1"/>
+          <w:numId w:val="0"/>
+        </w:numPr>
+        <w:spacing w:before="0"/>
+        <w:rPr>
+          <w:rFonts w:ascii="Arial" w:eastAsia="Arial" w:hAnsi="Arial" w:cs="Arial"/>
+          <w:b/>
+          <w:bCs/>
+          <w:color w:val="auto"/>
+          <w:sz w:val="24"/>
+          <w:szCs w:val="24"/>
+        </w:rPr>
+      </w:pPr>
+      <w:bookmarkStart w:id="39" w:name="_Toc171253026"/>
+      <w:r>
+        <w:rPr>
+          <w:rFonts w:ascii="Arial" w:eastAsia="Arial" w:hAnsi="Arial" w:cs="Arial"/>
+          <w:b/>
+          <w:bCs/>
+          <w:color w:val="auto"/>
+          <w:sz w:val="24"/>
+          <w:szCs w:val="24"/>
+        </w:rPr>
+        <w:t>11</w:t>
+      </w:r>
+      <w:r>
+        <w:rPr>
+          <w:rFonts w:ascii="Arial" w:hAnsi="Arial" w:cs="Arial"/>
+        </w:rPr>
+        <w:tab/>
+      </w:r>
+      <w:r>
+        <w:rPr>
+          <w:rFonts w:ascii="Arial" w:eastAsia="Arial" w:hAnsi="Arial" w:cs="Arial"/>
+          <w:b/>
+          <w:bCs/>
+          <w:color w:val="auto"/>
+          <w:sz w:val="24"/>
+          <w:szCs w:val="24"/>
+        </w:rPr>
+        <w:t>Criptografia</w:t>
+      </w:r>
+      <w:bookmarkEnd w:id="39"/>
+    </w:p>
+    <w:p>
+      <w:pPr>
+        <w:ind w:left="720"/>
+        <w:rPr>
+          <w:rFonts w:ascii="Arial" w:eastAsia="Arial" w:hAnsi="Arial" w:cs="Arial"/>
+          <w:color w:val="000000" w:themeColor="text1"/>
+          <w:sz w:val="24"/>
+          <w:szCs w:val="24"/>
+        </w:rPr>
+      </w:pPr>
+    </w:p>
+    <w:p>
+      <w:pPr>
+        <w:ind w:left="720"/>
+        <w:rPr>
+          <w:rFonts w:ascii="Arial" w:eastAsia="Arial" w:hAnsi="Arial" w:cs="Arial"/>
+          <w:color w:val="000000" w:themeColor="text1"/>
+          <w:sz w:val="24"/>
+          <w:szCs w:val="24"/>
+        </w:rPr>
+      </w:pPr>
+      <w:r>
+        <w:rPr>
+          <w:rFonts w:ascii="Arial" w:eastAsia="Arial" w:hAnsi="Arial" w:cs="Arial"/>
+          <w:color w:val="000000" w:themeColor="text1"/>
+          <w:sz w:val="24"/>
+          <w:szCs w:val="24"/>
+        </w:rPr>
+        <w:t>Iremos implementar a criptografia bcrypt para proteger dados em repouso, pois é uma tecnologia amplamente reconhecida e utilizada, com uma comunidade ativa que facilita a correção de possíveis falhas de forma rápida, simples e eficaz. As chaves de criptografia serão gerenciadas de forma segura para garantir a integridade do sistema.</w:t>
+      </w:r>
+    </w:p>
+    <w:p>
+      <w:pPr>
+        <w:ind w:left="720"/>
+        <w:rPr>
+          <w:rFonts w:ascii="Arial" w:eastAsia="Arial" w:hAnsi="Arial" w:cs="Arial"/>
+          <w:color w:val="0000FF"/>
+          <w:sz w:val="24"/>
+          <w:szCs w:val="24"/>
+        </w:rPr>
+      </w:pPr>
+    </w:p>
+    <w:p>
+      <w:pPr>
+        <w:ind w:left="720"/>
+        <w:rPr>
+          <w:rFonts w:ascii="Arial" w:eastAsia="Arial" w:hAnsi="Arial" w:cs="Arial"/>
+          <w:color w:val="000000" w:themeColor="text1"/>
+          <w:sz w:val="24"/>
+          <w:szCs w:val="24"/>
+        </w:rPr>
+      </w:pPr>
+    </w:p>
+    <w:p>
+      <w:pPr>
+        <w:pStyle w:val="Ttulo2"/>
+        <w:numPr>
+          <w:ilvl w:val="1"/>
+          <w:numId w:val="0"/>
+        </w:numPr>
+        <w:spacing w:before="0"/>
+        <w:rPr>
+          <w:rFonts w:ascii="Arial" w:eastAsia="Arial" w:hAnsi="Arial" w:cs="Arial"/>
+          <w:b/>
+          <w:bCs/>
+          <w:color w:val="auto"/>
+          <w:sz w:val="24"/>
+          <w:szCs w:val="24"/>
+        </w:rPr>
+      </w:pPr>
+      <w:bookmarkStart w:id="40" w:name="_Toc171253027"/>
+      <w:r>
+        <w:rPr>
+          <w:rFonts w:ascii="Arial" w:eastAsia="Arial" w:hAnsi="Arial" w:cs="Arial"/>
+          <w:b/>
+          <w:bCs/>
+          <w:color w:val="auto"/>
+          <w:sz w:val="24"/>
+          <w:szCs w:val="24"/>
+        </w:rPr>
+        <w:t>12</w:t>
+      </w:r>
+      <w:r>
+        <w:rPr>
+          <w:rFonts w:ascii="Arial" w:hAnsi="Arial" w:cs="Arial"/>
+        </w:rPr>
+        <w:tab/>
+      </w:r>
+      <w:r>
+        <w:rPr>
+          <w:rFonts w:ascii="Arial" w:eastAsia="Arial" w:hAnsi="Arial" w:cs="Arial"/>
+          <w:b/>
+          <w:bCs/>
+          <w:color w:val="auto"/>
+          <w:sz w:val="24"/>
+          <w:szCs w:val="24"/>
+        </w:rPr>
         <w:t>Backup</w:t>
       </w:r>
-      <w:bookmarkEnd w:id="39"/>
+      <w:bookmarkEnd w:id="40"/>
     </w:p>
     <w:p>
       <w:pPr>
@@ -11229,7 +11253,7 @@
           <w:szCs w:val="24"/>
         </w:rPr>
       </w:pPr>
-      <w:bookmarkStart w:id="40" w:name="_Toc171253028"/>
+      <w:bookmarkStart w:id="41" w:name="_Toc171253028"/>
       <w:r>
         <w:rPr>
           <w:rFonts w:ascii="Arial" w:eastAsia="Arial" w:hAnsi="Arial" w:cs="Arial"/>
@@ -11239,7 +11263,7 @@
         </w:rPr>
         <w:t>Gerenciamento de Vulnerabilidades</w:t>
       </w:r>
-      <w:bookmarkEnd w:id="40"/>
+      <w:bookmarkEnd w:id="41"/>
     </w:p>
     <w:p>
       <w:pPr>
@@ -11269,7 +11293,7 @@
           <w:szCs w:val="24"/>
         </w:rPr>
       </w:pPr>
-      <w:bookmarkStart w:id="41" w:name="_Toc171253029"/>
+      <w:bookmarkStart w:id="42" w:name="_Toc171253029"/>
       <w:r>
         <w:rPr>
           <w:rFonts w:ascii="Arial" w:eastAsia="Arial" w:hAnsi="Arial" w:cs="Arial"/>
@@ -11298,38 +11322,29 @@
         </w:rPr>
         <w:t>Atualizações e Patches</w:t>
       </w:r>
-      <w:bookmarkEnd w:id="41"/>
-    </w:p>
-    <w:p>
-      <w:pPr>
-        <w:ind w:left="720"/>
-        <w:rPr>
-          <w:rFonts w:ascii="Arial" w:eastAsia="Arial" w:hAnsi="Arial" w:cs="Arial"/>
-          <w:color w:val="000000" w:themeColor="text1"/>
-          <w:sz w:val="24"/>
-          <w:szCs w:val="24"/>
-        </w:rPr>
-      </w:pPr>
-    </w:p>
-    <w:p>
-      <w:pPr>
-        <w:ind w:left="720"/>
-        <w:rPr>
-          <w:rFonts w:ascii="Arial" w:eastAsia="Arial" w:hAnsi="Arial" w:cs="Arial"/>
-          <w:color w:val="000000" w:themeColor="text1"/>
-          <w:sz w:val="24"/>
-          <w:szCs w:val="24"/>
-        </w:rPr>
-      </w:pPr>
-      <w:r>
-        <w:rPr>
-          <w:rFonts w:ascii="Arial" w:eastAsia="Arial" w:hAnsi="Arial" w:cs="Arial"/>
-          <w:color w:val="000000" w:themeColor="text1"/>
-          <w:sz w:val="24"/>
-          <w:szCs w:val="24"/>
-        </w:rPr>
-        <w:t xml:space="preserve">Vamos disponibilizar patches de segurança obrigatórios para todos os membros da empresa, garantindo a segurança contínua do sistema e evitando possíveis pontos de vulnerabilidade que possam ser explorados por ataques cibernéticos. Essa </w:t>
-      </w:r>
+      <w:bookmarkEnd w:id="42"/>
+    </w:p>
+    <w:p>
+      <w:pPr>
+        <w:ind w:left="720"/>
+        <w:rPr>
+          <w:rFonts w:ascii="Arial" w:eastAsia="Arial" w:hAnsi="Arial" w:cs="Arial"/>
+          <w:color w:val="000000" w:themeColor="text1"/>
+          <w:sz w:val="24"/>
+          <w:szCs w:val="24"/>
+        </w:rPr>
+      </w:pPr>
+    </w:p>
+    <w:p>
+      <w:pPr>
+        <w:ind w:left="720"/>
+        <w:rPr>
+          <w:rFonts w:ascii="Arial" w:eastAsia="Arial" w:hAnsi="Arial" w:cs="Arial"/>
+          <w:color w:val="000000" w:themeColor="text1"/>
+          <w:sz w:val="24"/>
+          <w:szCs w:val="24"/>
+        </w:rPr>
+      </w:pPr>
       <w:r>
         <w:rPr>
           <w:rFonts w:ascii="Arial" w:eastAsia="Arial" w:hAnsi="Arial" w:cs="Arial"/>
@@ -11338,7 +11353,7 @@
           <w:szCs w:val="24"/>
         </w:rPr>
         <w:lastRenderedPageBreak/>
-        <w:t>medida reforça o compromisso com a proteção dos dados e a integridade do sistema.</w:t>
+        <w:t>Vamos disponibilizar patches de segurança obrigatórios para todos os membros da empresa, garantindo a segurança contínua do sistema e evitando possíveis pontos de vulnerabilidade que possam ser explorados por ataques cibernéticos. Essa medida reforça o compromisso com a proteção dos dados e a integridade do sistema.</w:t>
       </w:r>
     </w:p>
     <w:p>
@@ -11369,7 +11384,7 @@
           <w:szCs w:val="24"/>
         </w:rPr>
       </w:pPr>
-      <w:bookmarkStart w:id="42" w:name="_Toc171253030"/>
+      <w:bookmarkStart w:id="43" w:name="_Toc171253030"/>
       <w:r>
         <w:rPr>
           <w:rFonts w:ascii="Arial" w:eastAsia="Arial" w:hAnsi="Arial" w:cs="Arial"/>
@@ -11398,7 +11413,7 @@
         </w:rPr>
         <w:t>Testes de Penetração</w:t>
       </w:r>
-      <w:bookmarkEnd w:id="42"/>
+      <w:bookmarkEnd w:id="43"/>
     </w:p>
     <w:p>
       <w:pPr>
@@ -11612,7 +11627,7 @@
           <w:szCs w:val="24"/>
         </w:rPr>
       </w:pPr>
-      <w:bookmarkStart w:id="43" w:name="_Toc171253031"/>
+      <w:bookmarkStart w:id="44" w:name="_Toc171253031"/>
       <w:r>
         <w:rPr>
           <w:rFonts w:ascii="Arial" w:eastAsia="Arial" w:hAnsi="Arial" w:cs="Arial"/>
@@ -11641,7 +11656,7 @@
         </w:rPr>
         <w:t>Controles de medidas de segurança</w:t>
       </w:r>
-      <w:bookmarkEnd w:id="43"/>
+      <w:bookmarkEnd w:id="44"/>
     </w:p>
     <w:p>
       <w:pPr>
@@ -11715,6 +11730,7 @@
           <w:sz w:val="24"/>
           <w:szCs w:val="24"/>
         </w:rPr>
+        <w:lastRenderedPageBreak/>
         <w:t>O usuário será obrigado a inserir este token durante o processo de cadastramento para confirmar a veracidade do email, fortalecendo assim a autenticidade das informações fornecidas.</w:t>
       </w:r>
     </w:p>
@@ -11755,7 +11771,6 @@
           <w:sz w:val="24"/>
           <w:szCs w:val="24"/>
         </w:rPr>
-        <w:lastRenderedPageBreak/>
         <w:t>Para acessar o sistema, os usuários serão obrigados a fornecer uma senha e utilizar um token enviado via email.</w:t>
       </w:r>
     </w:p>
@@ -12009,7 +12024,7 @@
           <w:szCs w:val="24"/>
         </w:rPr>
       </w:pPr>
-      <w:bookmarkStart w:id="44" w:name="_Toc171253032"/>
+      <w:bookmarkStart w:id="45" w:name="_Toc171253032"/>
       <w:r>
         <w:rPr>
           <w:rFonts w:ascii="Arial" w:eastAsia="Arial" w:hAnsi="Arial" w:cs="Arial"/>
@@ -12034,7 +12049,7 @@
         </w:rPr>
         <w:t>Monitoramento e Auditoria</w:t>
       </w:r>
-      <w:bookmarkEnd w:id="44"/>
+      <w:bookmarkEnd w:id="45"/>
     </w:p>
     <w:p>
       <w:pPr>
@@ -12060,7 +12075,7 @@
           <w:szCs w:val="24"/>
         </w:rPr>
       </w:pPr>
-      <w:bookmarkStart w:id="45" w:name="_Toc171253033"/>
+      <w:bookmarkStart w:id="46" w:name="_Toc171253033"/>
       <w:r>
         <w:rPr>
           <w:rFonts w:ascii="Arial" w:eastAsia="Arial" w:hAnsi="Arial" w:cs="Arial"/>
@@ -12100,7 +12115,7 @@
         </w:rPr>
         <w:t>Monitoramento Contínuo</w:t>
       </w:r>
-      <w:bookmarkEnd w:id="45"/>
+      <w:bookmarkEnd w:id="46"/>
     </w:p>
     <w:p>
       <w:pPr>
@@ -12172,7 +12187,7 @@
           <w:szCs w:val="24"/>
         </w:rPr>
       </w:pPr>
-      <w:bookmarkStart w:id="46" w:name="_Toc171253034"/>
+      <w:bookmarkStart w:id="47" w:name="_Toc171253034"/>
       <w:r>
         <w:rPr>
           <w:rFonts w:ascii="Arial" w:eastAsia="Arial" w:hAnsi="Arial" w:cs="Arial"/>
@@ -12212,7 +12227,7 @@
         </w:rPr>
         <w:t>Auditoria</w:t>
       </w:r>
-      <w:bookmarkEnd w:id="46"/>
+      <w:bookmarkEnd w:id="47"/>
     </w:p>
     <w:p>
       <w:pPr>
@@ -12242,7 +12257,17 @@
           <w:sz w:val="24"/>
           <w:szCs w:val="24"/>
         </w:rPr>
-        <w:t>A empresa realizará auditorias externas regularmente para garantir o bom funcionamento e a integridade de todo o sistema, visando assegurar que os sistemas operem da melhor forma possível. Os resultados das auditorias serão documentados e revisados para garantir a conformidade com os padrões de segurança estabelecidos.</w:t>
+        <w:t xml:space="preserve">A empresa realizará auditorias externas regularmente para garantir o bom funcionamento e a integridade de todo o sistema, visando assegurar que os sistemas operem da melhor forma possível. Os resultados das auditorias serão </w:t>
+      </w:r>
+      <w:r>
+        <w:rPr>
+          <w:rFonts w:ascii="Arial" w:eastAsia="Arial" w:hAnsi="Arial" w:cs="Arial"/>
+          <w:color w:val="000000" w:themeColor="text1"/>
+          <w:sz w:val="24"/>
+          <w:szCs w:val="24"/>
+        </w:rPr>
+        <w:lastRenderedPageBreak/>
+        <w:t>documentados e revisados para garantir a conformidade com os padrões de segurança estabelecidos.</w:t>
       </w:r>
     </w:p>
     <w:p>
@@ -12293,7 +12318,7 @@
           <w:szCs w:val="24"/>
         </w:rPr>
       </w:pPr>
-      <w:bookmarkStart w:id="47" w:name="_Toc171253035"/>
+      <w:bookmarkStart w:id="48" w:name="_Toc171253035"/>
       <w:r>
         <w:rPr>
           <w:rFonts w:ascii="Arial" w:hAnsi="Arial" w:cs="Arial"/>
@@ -12336,7 +12361,7 @@
         </w:rPr>
         <w:t>es</w:t>
       </w:r>
-      <w:bookmarkEnd w:id="47"/>
+      <w:bookmarkEnd w:id="48"/>
     </w:p>
     <w:p>
       <w:pPr>
@@ -12362,7 +12387,7 @@
           <w:szCs w:val="24"/>
         </w:rPr>
       </w:pPr>
-      <w:bookmarkStart w:id="48" w:name="_Toc171253036"/>
+      <w:bookmarkStart w:id="49" w:name="_Toc171253036"/>
       <w:r>
         <w:rPr>
           <w:rFonts w:ascii="Arial" w:eastAsia="Arial" w:hAnsi="Arial" w:cs="Arial"/>
@@ -12413,7 +12438,7 @@
         </w:rPr>
         <w:t>Plano de Resposta a Incidentes</w:t>
       </w:r>
-      <w:bookmarkEnd w:id="48"/>
+      <w:bookmarkEnd w:id="49"/>
     </w:p>
     <w:p>
       <w:pPr>
@@ -12474,7 +12499,7 @@
           <w:szCs w:val="24"/>
         </w:rPr>
       </w:pPr>
-      <w:bookmarkStart w:id="49" w:name="_Toc171253037"/>
+      <w:bookmarkStart w:id="50" w:name="_Toc171253037"/>
       <w:r>
         <w:rPr>
           <w:rFonts w:ascii="Arial" w:eastAsia="Arial" w:hAnsi="Arial" w:cs="Arial"/>
@@ -12525,7 +12550,7 @@
         </w:rPr>
         <w:t>Comunicação de Incidentes</w:t>
       </w:r>
-      <w:bookmarkEnd w:id="49"/>
+      <w:bookmarkEnd w:id="50"/>
     </w:p>
     <w:p>
       <w:pPr>
@@ -12586,7 +12611,7 @@
           <w:szCs w:val="24"/>
         </w:rPr>
       </w:pPr>
-      <w:bookmarkStart w:id="50" w:name="_Toc171253038"/>
+      <w:bookmarkStart w:id="51" w:name="_Toc171253038"/>
       <w:r>
         <w:rPr>
           <w:rFonts w:ascii="Arial" w:eastAsia="Arial" w:hAnsi="Arial" w:cs="Arial"/>
@@ -12604,7 +12629,6 @@
         </w:rPr>
         <w:tab/>
       </w:r>
-      <w:bookmarkEnd w:id="50"/>
       <w:r>
         <w:rPr>
           <w:rFonts w:ascii="Arial" w:eastAsia="Arial" w:hAnsi="Arial" w:cs="Arial"/>
@@ -12614,8 +12638,9 @@
           <w:sz w:val="24"/>
           <w:szCs w:val="24"/>
         </w:rPr>
-        <w:t>Conformidades</w:t>
-      </w:r>
+        <w:t>CONFORMIDADE</w:t>
+      </w:r>
+      <w:bookmarkEnd w:id="51"/>
     </w:p>
     <w:p>
       <w:pPr>
@@ -12748,7 +12773,7 @@
         <w:lastRenderedPageBreak/>
         <w:tab/>
       </w:r>
-      <w:bookmarkStart w:id="51" w:name="_Toc171253039"/>
+      <w:bookmarkStart w:id="52" w:name="_Toc171253039"/>
       <w:r>
         <w:rPr>
           <w:rFonts w:ascii="Arial" w:eastAsia="Arial" w:hAnsi="Arial" w:cs="Arial"/>
@@ -12758,7 +12783,7 @@
         </w:rPr>
         <w:t>Aprovações</w:t>
       </w:r>
-      <w:bookmarkEnd w:id="51"/>
+      <w:bookmarkEnd w:id="52"/>
     </w:p>
     <w:p>
       <w:pPr>
@@ -13042,7 +13067,7 @@
         <w:lastRenderedPageBreak/>
         <w:tab/>
       </w:r>
-      <w:bookmarkStart w:id="52" w:name="_Toc171253040"/>
+      <w:bookmarkStart w:id="53" w:name="_Toc171253040"/>
       <w:r>
         <w:rPr>
           <w:rFonts w:ascii="Arial" w:eastAsia="Arial" w:hAnsi="Arial" w:cs="Arial"/>
@@ -13061,7 +13086,7 @@
         </w:rPr>
         <w:t>s:</w:t>
       </w:r>
-      <w:bookmarkEnd w:id="52"/>
+      <w:bookmarkEnd w:id="53"/>
     </w:p>
     <w:p>
       <w:pPr>
@@ -13125,7 +13150,7 @@
           <w:szCs w:val="24"/>
         </w:rPr>
       </w:pPr>
-      <w:bookmarkStart w:id="53" w:name="_Toc171253041"/>
+      <w:bookmarkStart w:id="54" w:name="_Toc171253041"/>
       <w:r>
         <w:rPr>
           <w:rFonts w:ascii="Arial" w:eastAsia="Arial" w:hAnsi="Arial" w:cs="Arial"/>
@@ -13154,7 +13179,7 @@
         </w:rPr>
         <w:t>Contatos de Segurança</w:t>
       </w:r>
-      <w:bookmarkEnd w:id="53"/>
+      <w:bookmarkEnd w:id="54"/>
     </w:p>
     <w:p>
       <w:pPr>
@@ -13396,8 +13421,8 @@
           <w:szCs w:val="24"/>
         </w:rPr>
       </w:pPr>
-      <w:bookmarkStart w:id="54" w:name="_Toc167372418_Copia_1"/>
-      <w:bookmarkStart w:id="55" w:name="_Toc171253042"/>
+      <w:bookmarkStart w:id="55" w:name="_Toc167372418_Copia_1"/>
+      <w:bookmarkStart w:id="56" w:name="_Toc171253042"/>
       <w:r>
         <w:rPr>
           <w:rFonts w:ascii="Arial" w:eastAsia="Arial" w:hAnsi="Arial" w:cs="Arial"/>
@@ -13416,7 +13441,7 @@
         </w:rPr>
         <w:tab/>
       </w:r>
-      <w:bookmarkEnd w:id="54"/>
+      <w:bookmarkEnd w:id="55"/>
       <w:r>
         <w:rPr>
           <w:rFonts w:ascii="Arial" w:eastAsia="Arial" w:hAnsi="Arial" w:cs="Arial"/>
@@ -13428,7 +13453,7 @@
         </w:rPr>
         <w:t>Glossário de termos</w:t>
       </w:r>
-      <w:bookmarkEnd w:id="55"/>
+      <w:bookmarkEnd w:id="56"/>
     </w:p>
     <w:p>
       <w:pPr>
@@ -13620,7 +13645,7 @@
           <w:szCs w:val="24"/>
         </w:rPr>
       </w:pPr>
-      <w:bookmarkStart w:id="56" w:name="_Toc171253043"/>
+      <w:bookmarkStart w:id="57" w:name="_Toc171253043"/>
       <w:r>
         <w:rPr>
           <w:rFonts w:ascii="Arial" w:eastAsia="Arial" w:hAnsi="Arial" w:cs="Arial"/>
@@ -13649,21 +13674,25 @@
         </w:rPr>
         <w:t>Referências Bibliográficas</w:t>
       </w:r>
-      <w:bookmarkEnd w:id="56"/>
-    </w:p>
-    <w:p>
-      <w:pPr>
-        <w:ind w:left="720"/>
-        <w:rPr>
-          <w:rFonts w:ascii="Arial" w:eastAsia="Arial" w:hAnsi="Arial" w:cs="Arial"/>
-          <w:color w:val="000000" w:themeColor="text1"/>
-          <w:sz w:val="24"/>
-          <w:szCs w:val="24"/>
-        </w:rPr>
-      </w:pPr>
-    </w:p>
-    <w:p>
-      <w:pPr>
+      <w:bookmarkEnd w:id="57"/>
+    </w:p>
+    <w:p>
+      <w:pPr>
+        <w:ind w:left="720"/>
+        <w:rPr>
+          <w:rFonts w:ascii="Arial" w:eastAsia="Arial" w:hAnsi="Arial" w:cs="Arial"/>
+          <w:color w:val="000000" w:themeColor="text1"/>
+          <w:sz w:val="24"/>
+          <w:szCs w:val="24"/>
+        </w:rPr>
+      </w:pPr>
+    </w:p>
+    <w:p>
+      <w:pPr>
+        <w:numPr>
+          <w:ilvl w:val="0"/>
+          <w:numId w:val="16"/>
+        </w:numPr>
         <w:ind w:left="720"/>
         <w:rPr>
           <w:rFonts w:ascii="Arial" w:eastAsia="Arial" w:hAnsi="Arial" w:cs="Arial"/>
@@ -14015,11 +14044,42 @@
           <w:r>
             <w:rPr>
               <w:rFonts w:ascii="Arial" w:hAnsi="Arial" w:cs="Arial"/>
-              <w:noProof/>
               <w:sz w:val="20"/>
               <w:szCs w:val="20"/>
             </w:rPr>
-            <w:t>SDA-T10-2024.1-PolíticaGeralDeSegurança-240307 2.docx</w:t>
+            <w:t>SDA-T10-2024.</w:t>
+          </w:r>
+          <w:r>
+            <w:rPr>
+              <w:rFonts w:ascii="Arial" w:hAnsi="Arial" w:cs="Arial"/>
+              <w:sz w:val="20"/>
+              <w:szCs w:val="20"/>
+            </w:rPr>
+            <w:t>2</w:t>
+          </w:r>
+          <w:r>
+            <w:rPr>
+              <w:rFonts w:ascii="Arial" w:hAnsi="Arial" w:cs="Arial"/>
+              <w:sz w:val="20"/>
+              <w:szCs w:val="20"/>
+            </w:rPr>
+            <w:t>-PolíticaGeralDeSegurança-240</w:t>
+          </w:r>
+          <w:r>
+            <w:rPr>
+              <w:rFonts w:ascii="Arial" w:hAnsi="Arial" w:cs="Arial"/>
+              <w:sz w:val="20"/>
+              <w:szCs w:val="20"/>
+            </w:rPr>
+            <w:t>7</w:t>
+          </w:r>
+          <w:r>
+            <w:rPr>
+              <w:rFonts w:ascii="Arial" w:hAnsi="Arial" w:cs="Arial"/>
+              <w:sz w:val="20"/>
+              <w:szCs w:val="20"/>
+            </w:rPr>
+            <w:t>07.docx</w:t>
           </w:r>
           <w:r>
             <w:rPr>
@@ -14325,11 +14385,10 @@
           <w:r>
             <w:rPr>
               <w:rFonts w:ascii="Tahoma" w:hAnsi="Tahoma" w:cs="Tahoma"/>
-              <w:noProof/>
               <w:sz w:val="20"/>
               <w:szCs w:val="20"/>
             </w:rPr>
-            <w:t>SDA-T10-2024.1-PolíticaGeralDeSegurança-240307 2.docx</w:t>
+            <w:t>SDA-T10-2024.1-PolíticaGeralDeSegurança-240307.docx</w:t>
           </w:r>
           <w:r>
             <w:rPr>
@@ -18158,8 +18217,6 @@
     <w:rsid w:val="000F579A"/>
     <w:rsid w:val="00165925"/>
     <w:rsid w:val="001A58EB"/>
-    <w:rsid w:val="001D06A5"/>
-    <w:rsid w:val="00202B0F"/>
     <w:rsid w:val="0026627F"/>
     <w:rsid w:val="002A5279"/>
     <w:rsid w:val="002D52A1"/>
@@ -18173,7 +18230,6 @@
     <w:rsid w:val="0079638A"/>
     <w:rsid w:val="00834E0B"/>
     <w:rsid w:val="00853EDE"/>
-    <w:rsid w:val="0089122F"/>
     <w:rsid w:val="008D0661"/>
     <w:rsid w:val="00A03407"/>
     <w:rsid w:val="00A46260"/>

</xml_diff>